<commit_message>
feat(medical-record): pin 中医特色治疗 protocol paragraph in inpatient reference template
</commit_message>
<xml_diff>
--- a/coshare_patientrecord_sys_backend/src/main/resources/medical-record-templates/inpatient-record-reference-v1.docx
+++ b/coshare_patientrecord_sys_backend/src/main/resources/medical-record-templates/inpatient-record-reference-v1.docx
@@ -6326,29 +6326,7 @@
           <w:shd w:val="clear" w:color="auto" w:fill="C0C0C0"/>
           <w:lang w:val="zh-CN" w:eastAsia="zh-CN" w:bidi="zh-CN"/>
         </w:rPr>
-        <w:t xml:space="preserve">              4、中医特色治疗：遵罗</w:t>
-      </w:r>
-      <w:r>
-        <w:rPr>
-          <w:rFonts w:hint="eastAsia" w:ascii="宋体" w:hAnsi="宋体" w:eastAsia="宋体"/>
-          <w:color w:val="000000"/>
-          <w:sz w:val="24"/>
-          <w:szCs w:val="24"/>
-          <w:shd w:val="clear" w:color="auto" w:fill="C0C0C0"/>
-          <w:lang w:val="en-US" w:eastAsia="zh-CN" w:bidi="zh-CN"/>
-        </w:rPr>
-        <w:t>x</w:t>
-      </w:r>
-      <w:r>
-        <w:rPr>
-          <w:rFonts w:hint="eastAsia" w:ascii="宋体" w:hAnsi="宋体" w:eastAsia="宋体"/>
-          <w:color w:val="000000"/>
-          <w:sz w:val="24"/>
-          <w:szCs w:val="24"/>
-          <w:shd w:val="clear" w:color="auto" w:fill="C0C0C0"/>
-          <w:lang w:val="zh-CN" w:eastAsia="zh-CN" w:bidi="zh-CN"/>
-        </w:rPr>
-        <w:t>主治医师医嘱，予红外线照射患处，熏洗治疗仪中药局部熏洗治疗，以镇痛、消炎、改善微循环、促进伤口愈合，予单侧耳穴压豆（取穴：神门、交感、内分泌、脾、肾）宁血安神，给予悬空灸（长强）缓解疼痛；辨证给予中药方剂应用，遵嘱执行。</w:t>
+        <w:t xml:space="preserve">              4、中医特色治疗：予局部中医熏洗治疗仪熏洗治疗 20 分钟，利用中药药液温热渗透，清热燥湿、活血消肿、敛疮止痛，改善肛周循环，减轻术区水肿疼痛，清洁创面；红外线照射 30 分钟，物理温热改善局部微循环，减少渗出，促进肉芽生长；肛周中药塌渍治疗 20 分钟，药物局部作用，清热解毒、祛腐生肌，缓解创面肿痛渗出；神阙穴悬灸 20 分钟，温阳理气、通调腑气，改善术后腹胀，调理肠道功能，扶助正气，促进肛门术后整体康复。</w:t>
       </w:r>
     </w:p>
     <w:p>

</xml_diff>